<commit_message>
Epic 3 - Vladyslav Troian
</commit_message>
<xml_diff>
--- a/ai_11/vladyslav_troian/epic_3/epic_3_report_vladyslav_troian.docx
+++ b/ai_11/vladyslav_troian/epic_3/epic_3_report_vladyslav_troian.docx
@@ -390,22 +390,6 @@
         <w:jc w:val="center"/>
         <w:rPr>
           <w:rFonts w:ascii="Times New Roman" w:cs="Times New Roman" w:eastAsia="Times New Roman" w:hAnsi="Times New Roman"/>
-          <w:sz w:val="28"/>
-          <w:szCs w:val="28"/>
-        </w:rPr>
-      </w:pPr>
-      <w:r>
-        <w:rPr>
-          <w:rtl w:val="0"/>
-        </w:rPr>
-      </w:r>
-    </w:p>
-    <w:p>
-      <w:pPr>
-        <w:spacing w:line="240" w:lineRule="auto"/>
-        <w:jc w:val="center"/>
-        <w:rPr>
-          <w:rFonts w:ascii="Times New Roman" w:cs="Times New Roman" w:eastAsia="Times New Roman" w:hAnsi="Times New Roman"/>
           <w:b w:val="1"/>
           <w:bCs w:val="1"/>
           <w:smallCaps w:val="1"/>
@@ -547,6 +531,7 @@
     </w:p>
     <w:p>
       <w:pPr>
+        <w:jc w:val="center"/>
         <w:rPr/>
       </w:pPr>
       <w:r>
@@ -557,14 +542,17 @@
     </w:p>
     <w:p>
       <w:pPr>
-        <w:rPr>
-          <w:rFonts w:ascii="Times New Roman" w:cs="Times New Roman" w:eastAsia="Times New Roman" w:hAnsi="Times New Roman"/>
-        </w:rPr>
-      </w:pPr>
-      <w:r>
-        <w:rPr>
-          <w:rtl w:val="0"/>
-        </w:rPr>
+        <w:jc w:val="center"/>
+        <w:rPr>
+          <w:rFonts w:ascii="Times New Roman" w:cs="Times New Roman" w:eastAsia="Times New Roman" w:hAnsi="Times New Roman"/>
+        </w:rPr>
+      </w:pPr>
+      <w:r>
+        <w:rPr>
+          <w:rFonts w:ascii="Times New Roman" w:cs="Times New Roman" w:eastAsia="Times New Roman" w:hAnsi="Times New Roman"/>
+          <w:rtl w:val="0"/>
+        </w:rPr>
+        <w:t xml:space="preserve">Львів 2026</w:t>
       </w:r>
     </w:p>
     <w:p>
@@ -3922,12 +3910,12 @@
           <wp:inline distB="114300" distT="114300" distL="114300" distR="114300">
             <wp:extent cx="5731200" cy="2921000"/>
             <wp:effectExtent b="0" l="0" r="0" t="0"/>
-            <wp:docPr id="15" name="image28.png"/>
+            <wp:docPr id="15" name="image27.png"/>
             <a:graphic>
               <a:graphicData uri="http://schemas.openxmlformats.org/drawingml/2006/picture">
                 <pic:pic>
                   <pic:nvPicPr>
-                    <pic:cNvPr id="0" name="image28.png"/>
+                    <pic:cNvPr id="0" name="image27.png"/>
                     <pic:cNvPicPr preferRelativeResize="0"/>
                   </pic:nvPicPr>
                   <pic:blipFill>
@@ -4044,12 +4032,12 @@
           <wp:inline distB="114300" distT="114300" distL="114300" distR="114300">
             <wp:extent cx="5731200" cy="2692400"/>
             <wp:effectExtent b="0" l="0" r="0" t="0"/>
-            <wp:docPr id="11" name="image29.png"/>
+            <wp:docPr id="11" name="image12.png"/>
             <a:graphic>
               <a:graphicData uri="http://schemas.openxmlformats.org/drawingml/2006/picture">
                 <pic:pic>
                   <pic:nvPicPr>
-                    <pic:cNvPr id="0" name="image29.png"/>
+                    <pic:cNvPr id="0" name="image12.png"/>
                     <pic:cNvPicPr preferRelativeResize="0"/>
                   </pic:nvPicPr>
                   <pic:blipFill>
@@ -4386,12 +4374,12 @@
           <wp:inline distB="114300" distT="114300" distL="114300" distR="114300">
             <wp:extent cx="5381338" cy="7626720"/>
             <wp:effectExtent b="0" l="0" r="0" t="0"/>
-            <wp:docPr id="25" name="image17.png"/>
+            <wp:docPr id="25" name="image23.png"/>
             <a:graphic>
               <a:graphicData uri="http://schemas.openxmlformats.org/drawingml/2006/picture">
                 <pic:pic>
                   <pic:nvPicPr>
-                    <pic:cNvPr id="0" name="image17.png"/>
+                    <pic:cNvPr id="0" name="image23.png"/>
                     <pic:cNvPicPr preferRelativeResize="0"/>
                   </pic:nvPicPr>
                   <pic:blipFill>
@@ -4489,12 +4477,12 @@
           <wp:inline distB="114300" distT="114300" distL="114300" distR="114300">
             <wp:extent cx="5731200" cy="8115300"/>
             <wp:effectExtent b="0" l="0" r="0" t="0"/>
-            <wp:docPr id="4" name="image10.png"/>
+            <wp:docPr id="4" name="image8.png"/>
             <a:graphic>
               <a:graphicData uri="http://schemas.openxmlformats.org/drawingml/2006/picture">
                 <pic:pic>
                   <pic:nvPicPr>
-                    <pic:cNvPr id="0" name="image10.png"/>
+                    <pic:cNvPr id="0" name="image8.png"/>
                     <pic:cNvPicPr preferRelativeResize="0"/>
                   </pic:nvPicPr>
                   <pic:blipFill>
@@ -4628,12 +4616,12 @@
           <wp:inline distB="114300" distT="114300" distL="114300" distR="114300">
             <wp:extent cx="5731200" cy="8115300"/>
             <wp:effectExtent b="0" l="0" r="0" t="0"/>
-            <wp:docPr id="2" name="image8.png"/>
+            <wp:docPr id="2" name="image5.png"/>
             <a:graphic>
               <a:graphicData uri="http://schemas.openxmlformats.org/drawingml/2006/picture">
                 <pic:pic>
                   <pic:nvPicPr>
-                    <pic:cNvPr id="0" name="image8.png"/>
+                    <pic:cNvPr id="0" name="image5.png"/>
                     <pic:cNvPicPr preferRelativeResize="0"/>
                   </pic:nvPicPr>
                   <pic:blipFill>
@@ -4767,12 +4755,12 @@
           <wp:inline distB="114300" distT="114300" distL="114300" distR="114300">
             <wp:extent cx="5734050" cy="5705475"/>
             <wp:effectExtent b="0" l="0" r="0" t="0"/>
-            <wp:docPr id="27" name="image14.png"/>
+            <wp:docPr id="27" name="image16.png"/>
             <a:graphic>
               <a:graphicData uri="http://schemas.openxmlformats.org/drawingml/2006/picture">
                 <pic:pic>
                   <pic:nvPicPr>
-                    <pic:cNvPr id="0" name="image14.png"/>
+                    <pic:cNvPr id="0" name="image16.png"/>
                     <pic:cNvPicPr preferRelativeResize="0"/>
                   </pic:nvPicPr>
                   <pic:blipFill>
@@ -5158,12 +5146,12 @@
           <wp:inline distB="114300" distT="114300" distL="114300" distR="114300">
             <wp:extent cx="5731200" cy="8115300"/>
             <wp:effectExtent b="0" l="0" r="0" t="0"/>
-            <wp:docPr id="18" name="image7.png"/>
+            <wp:docPr id="18" name="image4.png"/>
             <a:graphic>
               <a:graphicData uri="http://schemas.openxmlformats.org/drawingml/2006/picture">
                 <pic:pic>
                   <pic:nvPicPr>
-                    <pic:cNvPr id="0" name="image7.png"/>
+                    <pic:cNvPr id="0" name="image4.png"/>
                     <pic:cNvPicPr preferRelativeResize="0"/>
                   </pic:nvPicPr>
                   <pic:blipFill>
@@ -5297,12 +5285,12 @@
           <wp:inline distB="114300" distT="114300" distL="114300" distR="114300">
             <wp:extent cx="5731200" cy="8115300"/>
             <wp:effectExtent b="0" l="0" r="0" t="0"/>
-            <wp:docPr id="23" name="image15.png"/>
+            <wp:docPr id="23" name="image9.png"/>
             <a:graphic>
               <a:graphicData uri="http://schemas.openxmlformats.org/drawingml/2006/picture">
                 <pic:pic>
                   <pic:nvPicPr>
-                    <pic:cNvPr id="0" name="image15.png"/>
+                    <pic:cNvPr id="0" name="image9.png"/>
                     <pic:cNvPicPr preferRelativeResize="0"/>
                   </pic:nvPicPr>
                   <pic:blipFill>
@@ -5436,12 +5424,12 @@
           <wp:inline distB="114300" distT="114300" distL="114300" distR="114300">
             <wp:extent cx="5734050" cy="4010025"/>
             <wp:effectExtent b="0" l="0" r="0" t="0"/>
-            <wp:docPr id="7" name="image6.png"/>
+            <wp:docPr id="7" name="image2.png"/>
             <a:graphic>
               <a:graphicData uri="http://schemas.openxmlformats.org/drawingml/2006/picture">
                 <pic:pic>
                   <pic:nvPicPr>
-                    <pic:cNvPr id="0" name="image6.png"/>
+                    <pic:cNvPr id="0" name="image2.png"/>
                     <pic:cNvPicPr preferRelativeResize="0"/>
                   </pic:nvPicPr>
                   <pic:blipFill>
@@ -5898,12 +5886,12 @@
           <wp:inline distB="114300" distT="114300" distL="114300" distR="114300">
             <wp:extent cx="5731200" cy="3314700"/>
             <wp:effectExtent b="0" l="0" r="0" t="0"/>
-            <wp:docPr id="13" name="image12.png"/>
+            <wp:docPr id="13" name="image7.png"/>
             <a:graphic>
               <a:graphicData uri="http://schemas.openxmlformats.org/drawingml/2006/picture">
                 <pic:pic>
                   <pic:nvPicPr>
-                    <pic:cNvPr id="0" name="image12.png"/>
+                    <pic:cNvPr id="0" name="image7.png"/>
                     <pic:cNvPicPr preferRelativeResize="0"/>
                   </pic:nvPicPr>
                   <pic:blipFill>
@@ -6056,12 +6044,12 @@
           <wp:inline distB="114300" distT="114300" distL="114300" distR="114300">
             <wp:extent cx="5134726" cy="3332409"/>
             <wp:effectExtent b="0" l="0" r="0" t="0"/>
-            <wp:docPr id="14" name="image27.png"/>
+            <wp:docPr id="14" name="image24.png"/>
             <a:graphic>
               <a:graphicData uri="http://schemas.openxmlformats.org/drawingml/2006/picture">
                 <pic:pic>
                   <pic:nvPicPr>
-                    <pic:cNvPr id="0" name="image27.png"/>
+                    <pic:cNvPr id="0" name="image24.png"/>
                     <pic:cNvPicPr preferRelativeResize="0"/>
                   </pic:nvPicPr>
                   <pic:blipFill>
@@ -6213,12 +6201,12 @@
           <wp:inline distB="114300" distT="114300" distL="114300" distR="114300">
             <wp:extent cx="5386388" cy="3498468"/>
             <wp:effectExtent b="0" l="0" r="0" t="0"/>
-            <wp:docPr id="19" name="image24.png"/>
+            <wp:docPr id="19" name="image17.png"/>
             <a:graphic>
               <a:graphicData uri="http://schemas.openxmlformats.org/drawingml/2006/picture">
                 <pic:pic>
                   <pic:nvPicPr>
-                    <pic:cNvPr id="0" name="image24.png"/>
+                    <pic:cNvPr id="0" name="image17.png"/>
                     <pic:cNvPicPr preferRelativeResize="0"/>
                   </pic:nvPicPr>
                   <pic:blipFill>
@@ -6292,12 +6280,12 @@
           <wp:inline distB="114300" distT="114300" distL="114300" distR="114300">
             <wp:extent cx="5392575" cy="3668795"/>
             <wp:effectExtent b="0" l="0" r="0" t="0"/>
-            <wp:docPr id="1" name="image21.png"/>
+            <wp:docPr id="1" name="image6.png"/>
             <a:graphic>
               <a:graphicData uri="http://schemas.openxmlformats.org/drawingml/2006/picture">
                 <pic:pic>
                   <pic:nvPicPr>
-                    <pic:cNvPr id="0" name="image21.png"/>
+                    <pic:cNvPr id="0" name="image6.png"/>
                     <pic:cNvPicPr preferRelativeResize="0"/>
                   </pic:nvPicPr>
                   <pic:blipFill>
@@ -6373,12 +6361,12 @@
           <wp:inline distB="114300" distT="114300" distL="114300" distR="114300">
             <wp:extent cx="5731200" cy="2819400"/>
             <wp:effectExtent b="0" l="0" r="0" t="0"/>
-            <wp:docPr id="22" name="image25.png"/>
+            <wp:docPr id="22" name="image26.png"/>
             <a:graphic>
               <a:graphicData uri="http://schemas.openxmlformats.org/drawingml/2006/picture">
                 <pic:pic>
                   <pic:nvPicPr>
-                    <pic:cNvPr id="0" name="image25.png"/>
+                    <pic:cNvPr id="0" name="image26.png"/>
                     <pic:cNvPicPr preferRelativeResize="0"/>
                   </pic:nvPicPr>
                   <pic:blipFill>
@@ -6454,12 +6442,12 @@
           <wp:inline distB="114300" distT="114300" distL="114300" distR="114300">
             <wp:extent cx="5731200" cy="3492500"/>
             <wp:effectExtent b="0" l="0" r="0" t="0"/>
-            <wp:docPr id="10" name="image23.png"/>
+            <wp:docPr id="10" name="image11.png"/>
             <a:graphic>
               <a:graphicData uri="http://schemas.openxmlformats.org/drawingml/2006/picture">
                 <pic:pic>
                   <pic:nvPicPr>
-                    <pic:cNvPr id="0" name="image23.png"/>
+                    <pic:cNvPr id="0" name="image11.png"/>
                     <pic:cNvPicPr preferRelativeResize="0"/>
                   </pic:nvPicPr>
                   <pic:blipFill>
@@ -6535,12 +6523,12 @@
           <wp:inline distB="114300" distT="114300" distL="114300" distR="114300">
             <wp:extent cx="5731200" cy="4699000"/>
             <wp:effectExtent b="0" l="0" r="0" t="0"/>
-            <wp:docPr id="20" name="image20.png"/>
+            <wp:docPr id="20" name="image22.png"/>
             <a:graphic>
               <a:graphicData uri="http://schemas.openxmlformats.org/drawingml/2006/picture">
                 <pic:pic>
                   <pic:nvPicPr>
-                    <pic:cNvPr id="0" name="image20.png"/>
+                    <pic:cNvPr id="0" name="image22.png"/>
                     <pic:cNvPicPr preferRelativeResize="0"/>
                   </pic:nvPicPr>
                   <pic:blipFill>
@@ -6818,12 +6806,12 @@
           <wp:inline distB="114300" distT="114300" distL="114300" distR="114300">
             <wp:extent cx="5514975" cy="3838575"/>
             <wp:effectExtent b="0" l="0" r="0" t="0"/>
-            <wp:docPr id="21" name="image13.png"/>
+            <wp:docPr id="21" name="image14.png"/>
             <a:graphic>
               <a:graphicData uri="http://schemas.openxmlformats.org/drawingml/2006/picture">
                 <pic:pic>
                   <pic:nvPicPr>
-                    <pic:cNvPr id="0" name="image13.png"/>
+                    <pic:cNvPr id="0" name="image14.png"/>
                     <pic:cNvPicPr preferRelativeResize="0"/>
                   </pic:nvPicPr>
                   <pic:blipFill>
@@ -6997,12 +6985,12 @@
           <wp:inline distB="114300" distT="114300" distL="114300" distR="114300">
             <wp:extent cx="3819525" cy="828675"/>
             <wp:effectExtent b="0" l="0" r="0" t="0"/>
-            <wp:docPr id="17" name="image5.png"/>
+            <wp:docPr id="17" name="image13.png"/>
             <a:graphic>
               <a:graphicData uri="http://schemas.openxmlformats.org/drawingml/2006/picture">
                 <pic:pic>
                   <pic:nvPicPr>
-                    <pic:cNvPr id="0" name="image5.png"/>
+                    <pic:cNvPr id="0" name="image13.png"/>
                     <pic:cNvPicPr preferRelativeResize="0"/>
                   </pic:nvPicPr>
                   <pic:blipFill>
@@ -7155,12 +7143,12 @@
           <wp:inline distB="114300" distT="114300" distL="114300" distR="114300">
             <wp:extent cx="4371975" cy="2809875"/>
             <wp:effectExtent b="0" l="0" r="0" t="0"/>
-            <wp:docPr id="28" name="image16.png"/>
+            <wp:docPr id="28" name="image29.png"/>
             <a:graphic>
               <a:graphicData uri="http://schemas.openxmlformats.org/drawingml/2006/picture">
                 <pic:pic>
                   <pic:nvPicPr>
-                    <pic:cNvPr id="0" name="image16.png"/>
+                    <pic:cNvPr id="0" name="image29.png"/>
                     <pic:cNvPicPr preferRelativeResize="0"/>
                   </pic:nvPicPr>
                   <pic:blipFill>
@@ -7289,12 +7277,12 @@
           <wp:inline distB="114300" distT="114300" distL="114300" distR="114300">
             <wp:extent cx="5731200" cy="4889500"/>
             <wp:effectExtent b="0" l="0" r="0" t="0"/>
-            <wp:docPr id="24" name="image22.png"/>
+            <wp:docPr id="24" name="image25.png"/>
             <a:graphic>
               <a:graphicData uri="http://schemas.openxmlformats.org/drawingml/2006/picture">
                 <pic:pic>
                   <pic:nvPicPr>
-                    <pic:cNvPr id="0" name="image22.png"/>
+                    <pic:cNvPr id="0" name="image25.png"/>
                     <pic:cNvPicPr preferRelativeResize="0"/>
                   </pic:nvPicPr>
                   <pic:blipFill>
@@ -7374,12 +7362,12 @@
           <wp:inline distB="114300" distT="114300" distL="114300" distR="114300">
             <wp:extent cx="4276725" cy="5781675"/>
             <wp:effectExtent b="0" l="0" r="0" t="0"/>
-            <wp:docPr id="3" name="image11.png"/>
+            <wp:docPr id="3" name="image20.png"/>
             <a:graphic>
               <a:graphicData uri="http://schemas.openxmlformats.org/drawingml/2006/picture">
                 <pic:pic>
                   <pic:nvPicPr>
-                    <pic:cNvPr id="0" name="image11.png"/>
+                    <pic:cNvPr id="0" name="image20.png"/>
                     <pic:cNvPicPr preferRelativeResize="0"/>
                   </pic:nvPicPr>
                   <pic:blipFill>
@@ -7560,12 +7548,12 @@
           <wp:inline distB="114300" distT="114300" distL="114300" distR="114300">
             <wp:extent cx="1838325" cy="1009650"/>
             <wp:effectExtent b="0" l="0" r="0" t="0"/>
-            <wp:docPr id="26" name="image9.png"/>
+            <wp:docPr id="26" name="image21.png"/>
             <a:graphic>
               <a:graphicData uri="http://schemas.openxmlformats.org/drawingml/2006/picture">
                 <pic:pic>
                   <pic:nvPicPr>
-                    <pic:cNvPr id="0" name="image9.png"/>
+                    <pic:cNvPr id="0" name="image21.png"/>
                     <pic:cNvPicPr preferRelativeResize="0"/>
                   </pic:nvPicPr>
                   <pic:blipFill>
@@ -7766,12 +7754,12 @@
           <wp:inline distB="114300" distT="114300" distL="114300" distR="114300">
             <wp:extent cx="1905000" cy="781050"/>
             <wp:effectExtent b="0" l="0" r="0" t="0"/>
-            <wp:docPr id="5" name="image3.png"/>
+            <wp:docPr id="5" name="image10.png"/>
             <a:graphic>
               <a:graphicData uri="http://schemas.openxmlformats.org/drawingml/2006/picture">
                 <pic:pic>
                   <pic:nvPicPr>
-                    <pic:cNvPr id="0" name="image3.png"/>
+                    <pic:cNvPr id="0" name="image10.png"/>
                     <pic:cNvPicPr preferRelativeResize="0"/>
                   </pic:nvPicPr>
                   <pic:blipFill>
@@ -7886,12 +7874,12 @@
           <wp:inline distB="114300" distT="114300" distL="114300" distR="114300">
             <wp:extent cx="5731200" cy="5181600"/>
             <wp:effectExtent b="0" l="0" r="0" t="0"/>
-            <wp:docPr id="29" name="image26.png"/>
+            <wp:docPr id="29" name="image28.png"/>
             <a:graphic>
               <a:graphicData uri="http://schemas.openxmlformats.org/drawingml/2006/picture">
                 <pic:pic>
                   <pic:nvPicPr>
-                    <pic:cNvPr id="0" name="image26.png"/>
+                    <pic:cNvPr id="0" name="image28.png"/>
                     <pic:cNvPicPr preferRelativeResize="0"/>
                   </pic:nvPicPr>
                   <pic:blipFill>
@@ -8043,12 +8031,12 @@
           <wp:inline distB="114300" distT="114300" distL="114300" distR="114300">
             <wp:extent cx="5731200" cy="2565400"/>
             <wp:effectExtent b="0" l="0" r="0" t="0"/>
-            <wp:docPr id="6" name="image4.png"/>
+            <wp:docPr id="6" name="image19.png"/>
             <a:graphic>
               <a:graphicData uri="http://schemas.openxmlformats.org/drawingml/2006/picture">
                 <pic:pic>
                   <pic:nvPicPr>
-                    <pic:cNvPr id="0" name="image4.png"/>
+                    <pic:cNvPr id="0" name="image19.png"/>
                     <pic:cNvPicPr preferRelativeResize="0"/>
                   </pic:nvPicPr>
                   <pic:blipFill>
@@ -8131,12 +8119,12 @@
           <wp:inline distB="114300" distT="114300" distL="114300" distR="114300">
             <wp:extent cx="5731200" cy="4597400"/>
             <wp:effectExtent b="0" l="0" r="0" t="0"/>
-            <wp:docPr id="16" name="image19.png"/>
+            <wp:docPr id="16" name="image15.png"/>
             <a:graphic>
               <a:graphicData uri="http://schemas.openxmlformats.org/drawingml/2006/picture">
                 <pic:pic>
                   <pic:nvPicPr>
-                    <pic:cNvPr id="0" name="image19.png"/>
+                    <pic:cNvPr id="0" name="image15.png"/>
                     <pic:cNvPicPr preferRelativeResize="0"/>
                   </pic:nvPicPr>
                   <pic:blipFill>
@@ -8324,12 +8312,12 @@
           <wp:inline distB="114300" distT="114300" distL="114300" distR="114300">
             <wp:extent cx="5731200" cy="2603500"/>
             <wp:effectExtent b="0" l="0" r="0" t="0"/>
-            <wp:docPr id="12" name="image2.png"/>
+            <wp:docPr id="12" name="image3.png"/>
             <a:graphic>
               <a:graphicData uri="http://schemas.openxmlformats.org/drawingml/2006/picture">
                 <pic:pic>
                   <pic:nvPicPr>
-                    <pic:cNvPr id="0" name="image2.png"/>
+                    <pic:cNvPr id="0" name="image3.png"/>
                     <pic:cNvPicPr preferRelativeResize="0"/>
                   </pic:nvPicPr>
                   <pic:blipFill>

</xml_diff>